<commit_message>
Build the initial application structure
</commit_message>
<xml_diff>
--- a/FDR_Sentinel_Seven_Module_Prototype_Blueprint.docx
+++ b/FDR_Sentinel_Seven_Module_Prototype_Blueprint.docx
@@ -98,7 +98,23 @@
           <w:color w:val="475569"/>
           <w:sz w:val="20"/>
         </w:rPr>
-        <w:t>Smart India Hackathon 2026  |  Problem Statement ID 26265</w:t>
+        <w:t xml:space="preserve">Smart India Hackathon </w:t>
+      </w:r>
+      <w:proofErr w:type="gramStart"/>
+      <w:r>
+        <w:rPr>
+          <w:color w:val="475569"/>
+          <w:sz w:val="20"/>
+        </w:rPr>
+        <w:t>2026  |</w:t>
+      </w:r>
+      <w:proofErr w:type="gramEnd"/>
+      <w:r>
+        <w:rPr>
+          <w:color w:val="475569"/>
+          <w:sz w:val="20"/>
+        </w:rPr>
+        <w:t xml:space="preserve">  Problem Statement ID 26265</w:t>
       </w:r>
       <w:r>
         <w:rPr>
@@ -106,7 +122,23 @@
           <w:sz w:val="20"/>
         </w:rPr>
         <w:br/>
-        <w:t>AICTE Regulation Bureau  |  Smart Automation / Software</w:t>
+        <w:t xml:space="preserve">AICTE Regulation </w:t>
+      </w:r>
+      <w:proofErr w:type="gramStart"/>
+      <w:r>
+        <w:rPr>
+          <w:color w:val="475569"/>
+          <w:sz w:val="20"/>
+        </w:rPr>
+        <w:t>Bureau  |</w:t>
+      </w:r>
+      <w:proofErr w:type="gramEnd"/>
+      <w:r>
+        <w:rPr>
+          <w:color w:val="475569"/>
+          <w:sz w:val="20"/>
+        </w:rPr>
+        <w:t xml:space="preserve">  Smart Automation / Software</w:t>
       </w:r>
       <w:r>
         <w:rPr>
@@ -122,7 +154,23 @@
           <w:sz w:val="20"/>
         </w:rPr>
         <w:br/>
-        <w:t>Document type: Prototype implementation blueprint  |  Version 1.0</w:t>
+        <w:t xml:space="preserve">Document type: Prototype implementation </w:t>
+      </w:r>
+      <w:proofErr w:type="gramStart"/>
+      <w:r>
+        <w:rPr>
+          <w:color w:val="475569"/>
+          <w:sz w:val="20"/>
+        </w:rPr>
+        <w:t>blueprint  |</w:t>
+      </w:r>
+      <w:proofErr w:type="gramEnd"/>
+      <w:r>
+        <w:rPr>
+          <w:color w:val="475569"/>
+          <w:sz w:val="20"/>
+        </w:rPr>
+        <w:t xml:space="preserve">  </w:t>
       </w:r>
       <w:r>
         <w:rPr>
@@ -22302,10 +22350,7 @@
     </w:p>
     <w:p>
       <w:r>
-        <w:t>Suggested event names help modules communicate without direct table manipulation: `InstrumentCreated`, `InstrumentSubmitted`, `DocumentVersionAdded`, `ExtractionCompleted`, `ValidationCompleted`, `DiscrepancyRaised`, `DiscrepancyResolved`, `VerificationRequested`, `VerificationResponded`, `TrustLevelChanged`, `MaturityThresholdReached`, `ReminderQueued`, `ReminderDelivered`, `ReplacementLinked`, `ReleaseRequestSubmitted`, `ReleaseReadinessChanged`, `ApprovalRecorded`, `ExternalReleaseOutcomeRecorded`, `Audi</w:t>
-      </w:r>
-      <w:r>
-        <w:t>tChainVerified`. Each event has an event ID, aggregate ID, timestamp and correlation/request ID.</w:t>
+        <w:t>Suggested event names help modules communicate without direct table manipulation: `InstrumentCreated`, `InstrumentSubmitted`, `DocumentVersionAdded`, `ExtractionCompleted`, `ValidationCompleted`, `DiscrepancyRaised`, `DiscrepancyResolved`, `VerificationRequested`, `VerificationResponded`, `TrustLevelChanged`, `MaturityThresholdReached`, `ReminderQueued`, `ReminderDelivered`, `ReplacementLinked`, `ReleaseRequestSubmitted`, `ReleaseReadinessChanged`, `ApprovalRecorded`, `ExternalReleaseOutcomeRecorded`, `AuditChainVerified`. Each event has an event ID, aggregate ID, timestamp and correlation/request ID.</w:t>
       </w:r>
     </w:p>
     <w:p>
@@ -25683,6 +25728,8 @@
         <w:t>The eight USPs are optional enhancements discussed in the supplied research/context. The prototype should not build all of them before the secure deterministic lifecycle works. The table below assigns practical sequencing and a clear output boundary.</w:t>
       </w:r>
     </w:p>
+    <w:p/>
+    <w:p/>
     <w:tbl>
       <w:tblPr>
         <w:tblStyle w:val="TableGrid"/>
@@ -25725,6 +25772,7 @@
                 <w:color w:val="FFFFFF"/>
                 <w:sz w:val="15"/>
               </w:rPr>
+              <w:lastRenderedPageBreak/>
               <w:t>USP</w:t>
             </w:r>
           </w:p>
@@ -25858,7 +25906,6 @@
               <w:rPr>
                 <w:sz w:val="15"/>
               </w:rPr>
-              <w:lastRenderedPageBreak/>
               <w:t>1. Vision-LLM FDR extraction &amp; field reconciliation</w:t>
             </w:r>
           </w:p>
@@ -33502,10 +33549,7 @@
     </w:p>
     <w:p>
       <w:r>
-        <w:t>The supplied Synopsis and PRD contain their own external references and evidence register. This module blueprint does not invent new external citations or treat every secondary-source claim as verified. Before production implementation, open the relevant primary AICTE handbook/circular and confirm the current policy text and version; confirm legal, privacy, security and integration requirements with authorized owners. Treat NeSL e-BG only as an adjacent bank-guarantee precedent, not evidence of an FDR verif</w:t>
-      </w:r>
-      <w:r>
-        <w:t>ication API.</w:t>
+        <w:t>The supplied Synopsis and PRD contain their own external references and evidence register. This module blueprint does not invent new external citations or treat every secondary-source claim as verified. Before production implementation, open the relevant primary AICTE handbook/circular and confirm the current policy text and version; confirm legal, privacy, security and integration requirements with authorized owners. Treat NeSL e-BG only as an adjacent bank-guarantee precedent, not evidence of an FDR verification API.</w:t>
       </w:r>
     </w:p>
     <w:p>

</xml_diff>